<commit_message>
write up misc stuff
</commit_message>
<xml_diff>
--- a/05_dissertation/Progress Check Cover Sheet 2025-26 ENGLISH(1).docx
+++ b/05_dissertation/Progress Check Cover Sheet 2025-26 ENGLISH(1).docx
@@ -268,16 +268,23 @@
           <w:i/>
           <w:iCs/>
         </w:rPr>
-        <w:t xml:space="preserve"> Plan / draft of dissertation submission</w:t>
-      </w:r>
-    </w:p>
-    <w:p>
-      <w:pPr>
-        <w:rPr>
-          <w:i/>
-          <w:iCs/>
-        </w:rPr>
-      </w:pPr>
+        <w:t xml:space="preserve"> </w:t>
+      </w:r>
+    </w:p>
+    <w:p>
+      <w:pPr>
+        <w:rPr>
+          <w:i/>
+          <w:iCs/>
+        </w:rPr>
+      </w:pPr>
+      <w:r>
+        <w:rPr>
+          <w:i/>
+          <w:iCs/>
+        </w:rPr>
+        <w:t>Project notebooks and README files explaining code files.</w:t>
+      </w:r>
     </w:p>
     <w:p>
       <w:pPr>
@@ -348,6 +355,13 @@
           <w:i/>
           <w:iCs/>
         </w:rPr>
+        <w:t xml:space="preserve">Email: </w:t>
+      </w:r>
+      <w:r>
+        <w:rPr>
+          <w:i/>
+          <w:iCs/>
+        </w:rPr>
         <w:t>17</w:t>
       </w:r>
       <w:r>
@@ -363,7 +377,28 @@
           <w:i/>
           <w:iCs/>
         </w:rPr>
-        <w:t xml:space="preserve"> Dec 2025 - </w:t>
+        <w:t xml:space="preserve"> Dec 2025 </w:t>
+      </w:r>
+      <w:r>
+        <w:rPr>
+          <w:i/>
+          <w:iCs/>
+        </w:rPr>
+        <w:t>–</w:t>
+      </w:r>
+      <w:r>
+        <w:rPr>
+          <w:i/>
+          <w:iCs/>
+        </w:rPr>
+        <w:t xml:space="preserve"> </w:t>
+      </w:r>
+      <w:r>
+        <w:rPr>
+          <w:i/>
+          <w:iCs/>
+        </w:rPr>
+        <w:t>subject line: Tobias Nunn dissertation progress check, notebook and code links</w:t>
       </w:r>
     </w:p>
     <w:p>
@@ -417,7 +452,7 @@
           <w:noProof/>
         </w:rPr>
         <w:drawing>
-          <wp:anchor distT="0" distB="0" distL="114300" distR="114300" simplePos="0" relativeHeight="251658240" behindDoc="0" locked="0" layoutInCell="1" allowOverlap="1" wp14:anchorId="1B6606FB" wp14:editId="6C0B56BB">
+          <wp:anchor distT="0" distB="0" distL="114300" distR="114300" simplePos="0" relativeHeight="251658240" behindDoc="0" locked="0" layoutInCell="1" allowOverlap="1" wp14:anchorId="1B6606FB" wp14:editId="149A7D86">
             <wp:simplePos x="0" y="0"/>
             <wp:positionH relativeFrom="column">
               <wp:posOffset>1276350</wp:posOffset>
@@ -552,7 +587,7 @@
           <w:noProof/>
         </w:rPr>
         <w:drawing>
-          <wp:anchor distT="0" distB="0" distL="114300" distR="114300" simplePos="0" relativeHeight="251659264" behindDoc="0" locked="0" layoutInCell="1" allowOverlap="1" wp14:anchorId="461A90F1" wp14:editId="1C2C56D1">
+          <wp:anchor distT="0" distB="0" distL="114300" distR="114300" simplePos="0" relativeHeight="251659264" behindDoc="0" locked="0" layoutInCell="1" allowOverlap="1" wp14:anchorId="461A90F1" wp14:editId="0507BAEB">
             <wp:simplePos x="0" y="0"/>
             <wp:positionH relativeFrom="column">
               <wp:posOffset>1244600</wp:posOffset>

</xml_diff>